<commit_message>
Revise architecture to the external review and confirmed site inventory
Four decisions taken and applied across both diagrams and both docs:
corpus boundary by rule (94 units), Extract verbatim by code with the
model on Compose only, one chunk store with a hand-written configuration,
staff-knowledge capture as the second source with CRM as a channel.
Adds the relevance gate, load-bearing slot rule, caveat tags appended by
code, router precedence, and the staff-tagged fixture. Appends errata and
decision appendices to the working record.
</commit_message>
<xml_diff>
--- a/docs/Lime Green Technical Assistant - Mental Model and Working Record (1).docx
+++ b/docs/Lime Green Technical Assistant - Mental Model and Working Record (1).docx
@@ -18476,6 +18476,969 @@
         <w:t>The pre-interview technical exercise document from Birmingham City University (Debashish Das, September 2026). The job description for the AEC Solution Architect (AI/LLM Developer) KTP Associate, version 2. The Lime Green Products website (lime-green.co.uk): the home page, the products and support pages, the knowledge base, the FAQ, and the technical datasheets for Fine Stuff, Forte, Solo One Coat Lime Plaster, Silic8 MPL1 and Natural Lime Mortar Medium. Christensen, Hall, Dillon and Duncan, Harvard Business Review, September 2016; the Christensen Institute on Jobs to Be Done; Adams and Klement on job stories at Intercom; Ulwick on Outcome-Driven Innovation; Moesta on the forces of progress; the User Interviews field guide on Jobs to Be Done. Ollama's published hardware guidance (at least 8 GB of memory for 7B-class models, 16 GB for 13B, 32 GB for 33B) and independent 2026 hardware guides for the CPU-only speed ranges. Cardiff University's published interview scoring grid as an example of the UK higher-education scoring pattern.</w:t>
       </w:r>
     </w:p>
+    <w:p>
+      <w:pPr>
+        <w:pStyle w:val="Heading1"/>
+      </w:pPr>
+      <w:r>
+        <w:t>Appendix C. Errata from decision 0, 15 September 2026</w:t>
+      </w:r>
+    </w:p>
+    <w:p>
+      <w:r>
+        <w:t>The live inventory (sitemap, every product, knowledge-base, support and Warmshell page fetched once; three datasheet PDFs extracted with PyMuPDF) corrects the following statements in this record. The sections are left as written; this table is the correction of record. The full inventory is in docs/architecture/architecture.md.</w:t>
+      </w:r>
+    </w:p>
+    <w:tbl>
+      <w:tblPr>
+        <w:tblStyle w:val="TableGrid"/>
+        <w:tblW w:type="auto" w:w="0"/>
+        <w:tblLook w:firstColumn="1" w:firstRow="1" w:lastColumn="0" w:lastRow="0" w:noHBand="0" w:noVBand="1" w:val="04A0"/>
+      </w:tblPr>
+      <w:tblGrid>
+        <w:gridCol w:w="2256"/>
+        <w:gridCol w:w="2256"/>
+        <w:gridCol w:w="2256"/>
+        <w:gridCol w:w="2256"/>
+      </w:tblGrid>
+      <w:tr>
+        <w:tc>
+          <w:tcPr>
+            <w:tcW w:type="dxa" w:w="2256"/>
+          </w:tcPr>
+          <w:p>
+            <w:r>
+              <w:rPr>
+                <w:sz w:val="19"/>
+              </w:rPr>
+            </w:r>
+            <w:r>
+              <w:rPr>
+                <w:b/>
+                <w:sz w:val="19"/>
+              </w:rPr>
+              <w:t>Record says</w:t>
+            </w:r>
+          </w:p>
+        </w:tc>
+        <w:tc>
+          <w:tcPr>
+            <w:tcW w:type="dxa" w:w="2256"/>
+          </w:tcPr>
+          <w:p>
+            <w:r>
+              <w:rPr>
+                <w:sz w:val="19"/>
+              </w:rPr>
+            </w:r>
+            <w:r>
+              <w:rPr>
+                <w:b/>
+                <w:sz w:val="19"/>
+              </w:rPr>
+              <w:t>Found</w:t>
+            </w:r>
+          </w:p>
+        </w:tc>
+        <w:tc>
+          <w:tcPr>
+            <w:tcW w:type="dxa" w:w="2256"/>
+          </w:tcPr>
+          <w:p>
+            <w:r>
+              <w:rPr>
+                <w:sz w:val="19"/>
+              </w:rPr>
+            </w:r>
+            <w:r>
+              <w:rPr>
+                <w:b/>
+                <w:sz w:val="19"/>
+              </w:rPr>
+              <w:t>Sections</w:t>
+            </w:r>
+          </w:p>
+        </w:tc>
+        <w:tc>
+          <w:tcPr>
+            <w:tcW w:type="dxa" w:w="2256"/>
+          </w:tcPr>
+          <w:p>
+            <w:r>
+              <w:rPr>
+                <w:sz w:val="19"/>
+              </w:rPr>
+            </w:r>
+            <w:r>
+              <w:rPr>
+                <w:b/>
+                <w:sz w:val="19"/>
+              </w:rPr>
+              <w:t>Consequence</w:t>
+            </w:r>
+          </w:p>
+        </w:tc>
+      </w:tr>
+      <w:tr>
+        <w:tc>
+          <w:tcPr>
+            <w:tcW w:type="dxa" w:w="2256"/>
+          </w:tcPr>
+          <w:p>
+            <w:r>
+              <w:rPr>
+                <w:sz w:val="19"/>
+              </w:rPr>
+              <w:t>Sitemap and robots.txt could not be retrieved; decision 0 must not assume a sitemap</w:t>
+            </w:r>
+          </w:p>
+        </w:tc>
+        <w:tc>
+          <w:tcPr>
+            <w:tcW w:type="dxa" w:w="2256"/>
+          </w:tcPr>
+          <w:p>
+            <w:r>
+              <w:rPr>
+                <w:sz w:val="19"/>
+              </w:rPr>
+              <w:t>Both exist. The sitemap is complete and referenced from robots.txt</w:t>
+            </w:r>
+          </w:p>
+        </w:tc>
+        <w:tc>
+          <w:tcPr>
+            <w:tcW w:type="dxa" w:w="2256"/>
+          </w:tcPr>
+          <w:p>
+            <w:r>
+              <w:rPr>
+                <w:sz w:val="19"/>
+              </w:rPr>
+              <w:t>8.6; 10.2 polite-crawl row; Appendix A decision-0 fallbacks</w:t>
+            </w:r>
+          </w:p>
+        </w:tc>
+        <w:tc>
+          <w:tcPr>
+            <w:tcW w:type="dxa" w:w="2256"/>
+          </w:tcPr>
+          <w:p>
+            <w:r>
+              <w:rPr>
+                <w:sz w:val="19"/>
+              </w:rPr>
+              <w:t>Crawl by sitemap. In production, change detection reads the sitemap's last-modified: one request instead of one per document</w:t>
+            </w:r>
+          </w:p>
+        </w:tc>
+      </w:tr>
+      <w:tr>
+        <w:tc>
+          <w:tcPr>
+            <w:tcW w:type="dxa" w:w="2256"/>
+          </w:tcPr>
+          <w:p>
+            <w:r>
+              <w:rPr>
+                <w:sz w:val="19"/>
+              </w:rPr>
+              <w:t>Frequently asked questions page: 17 items in three sections</w:t>
+            </w:r>
+          </w:p>
+        </w:tc>
+        <w:tc>
+          <w:tcPr>
+            <w:tcW w:type="dxa" w:w="2256"/>
+          </w:tcPr>
+          <w:p>
+            <w:r>
+              <w:rPr>
+                <w:sz w:val="19"/>
+              </w:rPr>
+              <w:t>32 questions in five sections (General 10, Plasters 4, Mortars 4, Renders 5, Warmshell Systems 9); answers visible on the page</w:t>
+            </w:r>
+          </w:p>
+        </w:tc>
+        <w:tc>
+          <w:tcPr>
+            <w:tcW w:type="dxa" w:w="2256"/>
+          </w:tcPr>
+          <w:p>
+            <w:r>
+              <w:rPr>
+                <w:sz w:val="19"/>
+              </w:rPr>
+              <w:t>7.6 completeness check; 8.4; 8.6; 8.7; 10.2</w:t>
+            </w:r>
+          </w:p>
+        </w:tc>
+        <w:tc>
+          <w:tcPr>
+            <w:tcW w:type="dxa" w:w="2256"/>
+          </w:tcPr>
+          <w:p>
+            <w:r>
+              <w:rPr>
+                <w:sz w:val="19"/>
+              </w:rPr>
+              <w:t>The family completeness check must be redone against 32; the volume hypothesis may shift</w:t>
+            </w:r>
+          </w:p>
+        </w:tc>
+      </w:tr>
+      <w:tr>
+        <w:tc>
+          <w:tcPr>
+            <w:tcW w:type="dxa" w:w="2256"/>
+          </w:tcPr>
+          <w:p>
+            <w:r>
+              <w:rPr>
+                <w:sz w:val="19"/>
+              </w:rPr>
+              <w:t>Knowledge base: about five articles</w:t>
+            </w:r>
+          </w:p>
+        </w:tc>
+        <w:tc>
+          <w:tcPr>
+            <w:tcW w:type="dxa" w:w="2256"/>
+          </w:tcPr>
+          <w:p>
+            <w:r>
+              <w:rPr>
+                <w:sz w:val="19"/>
+              </w:rPr>
+              <w:t>17 URLs = 15 distinct articles + a video index page with no text + a superseded duplicate of the Building Regulations article. Six carry high technical value: render checklist, plastering onto laths, background preparation, colour consistency, hydraulic or hydrated lime, Building Regs and internal wall insulation</w:t>
+            </w:r>
+          </w:p>
+        </w:tc>
+        <w:tc>
+          <w:tcPr>
+            <w:tcW w:type="dxa" w:w="2256"/>
+          </w:tcPr>
+          <w:p>
+            <w:r>
+              <w:rPr>
+                <w:sz w:val="19"/>
+              </w:rPr>
+              <w:t>8.4; 8.6; 8.7</w:t>
+            </w:r>
+          </w:p>
+        </w:tc>
+        <w:tc>
+          <w:tcPr>
+            <w:tcW w:type="dxa" w:w="2256"/>
+          </w:tcPr>
+          <w:p>
+            <w:r>
+              <w:rPr>
+                <w:sz w:val="19"/>
+              </w:rPr>
+              <w:t>All 15 indexed; the duplicate and the video index excluded</w:t>
+            </w:r>
+          </w:p>
+        </w:tc>
+      </w:tr>
+      <w:tr>
+        <w:tc>
+          <w:tcPr>
+            <w:tcW w:type="dxa" w:w="2256"/>
+          </w:tcPr>
+          <w:p>
+            <w:r>
+              <w:rPr>
+                <w:sz w:val="19"/>
+              </w:rPr>
+              <w:t>Technical datasheets: about fifteen, dated 2015 to 2024, one per product</w:t>
+            </w:r>
+          </w:p>
+        </w:tc>
+        <w:tc>
+          <w:tcPr>
+            <w:tcW w:type="dxa" w:w="2256"/>
+          </w:tcPr>
+          <w:p>
+            <w:r>
+              <w:rPr>
+                <w:sz w:val="19"/>
+              </w:rPr>
+              <w:t>36 product pages; 33 have a datasheet; 34 PDFs (Natural Lime Mortar links Medium and Strong). Dates run 2015 (Forte) to October 2025 (Silguard). No datasheet: Solo Filler, Warmshell 660 Mesh, Silic8 AeroGel Adhesive. Link text varies; filenames carry spaces and typos</w:t>
+            </w:r>
+          </w:p>
+        </w:tc>
+        <w:tc>
+          <w:tcPr>
+            <w:tcW w:type="dxa" w:w="2256"/>
+          </w:tcPr>
+          <w:p>
+            <w:r>
+              <w:rPr>
+                <w:sz w:val="19"/>
+              </w:rPr>
+              <w:t>8.6; 8.7; 10.2 corpus-quality row</w:t>
+            </w:r>
+          </w:p>
+        </w:tc>
+        <w:tc>
+          <w:tcPr>
+            <w:tcW w:type="dxa" w:w="2256"/>
+          </w:tcPr>
+          <w:p>
+            <w:r>
+              <w:rPr>
+                <w:sz w:val="19"/>
+              </w:rPr>
+              <w:t>Classify by link text, never by filename. The named-product-with-no-datasheet case is real; a probe targets each of the three</w:t>
+            </w:r>
+          </w:p>
+        </w:tc>
+      </w:tr>
+      <w:tr>
+        <w:tc>
+          <w:tcPr>
+            <w:tcW w:type="dxa" w:w="2256"/>
+          </w:tcPr>
+          <w:p>
+            <w:r>
+              <w:rPr>
+                <w:sz w:val="19"/>
+              </w:rPr>
+              <w:t>Corpus: about forty documents</w:t>
+            </w:r>
+          </w:p>
+        </w:tc>
+        <w:tc>
+          <w:tcPr>
+            <w:tcW w:type="dxa" w:w="2256"/>
+          </w:tcPr>
+          <w:p>
+            <w:r>
+              <w:rPr>
+                <w:sz w:val="19"/>
+              </w:rPr>
+              <w:t>94 units in scope by rule: 36 product pages, 34 datasheets, 3 Warmshell system guides, 2 Warmshell system pages, the FAQ, 15 articles, 3 commercial pages. Out: colour and category pages, case studies, news, inspirations, SDS, DoP, EPD, Carbon, LRV, warranty and Agrément documents, brochures, the video index, the duplicate article</w:t>
+            </w:r>
+          </w:p>
+        </w:tc>
+        <w:tc>
+          <w:tcPr>
+            <w:tcW w:type="dxa" w:w="2256"/>
+          </w:tcPr>
+          <w:p>
+            <w:r>
+              <w:rPr>
+                <w:sz w:val="19"/>
+              </w:rPr>
+              <w:t>8.7 spend order; 10.2 about-forty row; Appendix A scope limits</w:t>
+            </w:r>
+          </w:p>
+        </w:tc>
+        <w:tc>
+          <w:tcPr>
+            <w:tcW w:type="dxa" w:w="2256"/>
+          </w:tcPr>
+          <w:p>
+            <w:r>
+              <w:rPr>
+                <w:sz w:val="19"/>
+              </w:rPr>
+              <w:t>The boundary is a rule, not a number. Embedding is minutes; the cost is extraction QA, bounded by the spend order; anything dropped is listed in the manifest as excluded, by name and link</w:t>
+            </w:r>
+          </w:p>
+        </w:tc>
+      </w:tr>
+      <w:tr>
+        <w:tc>
+          <w:tcPr>
+            <w:tcW w:type="dxa" w:w="2256"/>
+          </w:tcPr>
+          <w:p>
+            <w:r>
+              <w:rPr>
+                <w:sz w:val="19"/>
+              </w:rPr>
+              <w:t>Whether thermal figures for the insulation range are published: open</w:t>
+            </w:r>
+          </w:p>
+        </w:tc>
+        <w:tc>
+          <w:tcPr>
+            <w:tcW w:type="dxa" w:w="2256"/>
+          </w:tcPr>
+          <w:p>
+            <w:r>
+              <w:rPr>
+                <w:sz w:val="19"/>
+              </w:rPr>
+              <w:t>Published in the Warmshell system guides (IWI design guide, IWI installation guide, roof design guide) and one U-value on the EWI page (0.18 at 260 mm); not on product pages</w:t>
+            </w:r>
+          </w:p>
+        </w:tc>
+        <w:tc>
+          <w:tcPr>
+            <w:tcW w:type="dxa" w:w="2256"/>
+          </w:tcPr>
+          <w:p>
+            <w:r>
+              <w:rPr>
+                <w:sz w:val="19"/>
+              </w:rPr>
+              <w:t>10.8 open items</w:t>
+            </w:r>
+          </w:p>
+        </w:tc>
+        <w:tc>
+          <w:tcPr>
+            <w:tcW w:type="dxa" w:w="2256"/>
+          </w:tcPr>
+          <w:p>
+            <w:r>
+              <w:rPr>
+                <w:sz w:val="19"/>
+              </w:rPr>
+              <w:t>The three guides join tier one; the open item closes</w:t>
+            </w:r>
+          </w:p>
+        </w:tc>
+      </w:tr>
+      <w:tr>
+        <w:tc>
+          <w:tcPr>
+            <w:tcW w:type="dxa" w:w="2256"/>
+          </w:tcPr>
+          <w:p>
+            <w:r>
+              <w:rPr>
+                <w:sz w:val="19"/>
+              </w:rPr>
+              <w:t>Whether datasheets keep caveats and conditions beside their figures: open</w:t>
+            </w:r>
+          </w:p>
+        </w:tc>
+        <w:tc>
+          <w:tcPr>
+            <w:tcW w:type="dxa" w:w="2256"/>
+          </w:tcPr>
+          <w:p>
+            <w:r>
+              <w:rPr>
+                <w:sz w:val="19"/>
+              </w:rPr>
+              <w:t>Partial. Solo (2024) and Forte (2015): yes. Fine Stuff (2019): the 8 degree limit sits under Mixing and again under Curing as 8oC; the sentence not suitable for DIY plastering sits under Application; coverage prints 3m3 at 3mm thick</w:t>
+            </w:r>
+          </w:p>
+        </w:tc>
+        <w:tc>
+          <w:tcPr>
+            <w:tcW w:type="dxa" w:w="2256"/>
+          </w:tcPr>
+          <w:p>
+            <w:r>
+              <w:rPr>
+                <w:sz w:val="19"/>
+              </w:rPr>
+              <w:t>10.8 open items; 10.5 group one, qualifiers travel</w:t>
+            </w:r>
+          </w:p>
+        </w:tc>
+        <w:tc>
+          <w:tcPr>
+            <w:tcW w:type="dxa" w:w="2256"/>
+          </w:tcPr>
+          <w:p>
+            <w:r>
+              <w:rPr>
+                <w:sz w:val="19"/>
+              </w:rPr>
+              <w:t>Caveat sentences are tagged per document at ingestion and appended by code whenever a chunk of that document is printed or composed over; the qualifier check verifies within the printed passage only</w:t>
+            </w:r>
+          </w:p>
+        </w:tc>
+      </w:tr>
+      <w:tr>
+        <w:tc>
+          <w:tcPr>
+            <w:tcW w:type="dxa" w:w="2256"/>
+          </w:tcPr>
+          <w:p>
+            <w:r>
+              <w:rPr>
+                <w:sz w:val="19"/>
+              </w:rPr>
+              <w:t>PDF text quality: unverified</w:t>
+            </w:r>
+          </w:p>
+        </w:tc>
+        <w:tc>
+          <w:tcPr>
+            <w:tcW w:type="dxa" w:w="2256"/>
+          </w:tcPr>
+          <w:p>
+            <w:r>
+              <w:rPr>
+                <w:sz w:val="19"/>
+              </w:rPr>
+              <w:t>PyMuPDF extracts clean text layers; WebFetch cannot read the PDFs. Headings sit on their own lines. Solo's page-1 header block is emitted out of reading order; Forte's page 2 is an unheaded GHS hazard block; Solo's application section is one long bulleted list</w:t>
+            </w:r>
+          </w:p>
+        </w:tc>
+        <w:tc>
+          <w:tcPr>
+            <w:tcW w:type="dxa" w:w="2256"/>
+          </w:tcPr>
+          <w:p>
+            <w:r>
+              <w:rPr>
+                <w:sz w:val="19"/>
+              </w:rPr>
+              <w:t>10.2 corpus-quality row; 10.3 Ingest</w:t>
+            </w:r>
+          </w:p>
+        </w:tc>
+        <w:tc>
+          <w:tcPr>
+            <w:tcW w:type="dxa" w:w="2256"/>
+          </w:tcPr>
+          <w:p>
+            <w:r>
+              <w:rPr>
+                <w:sz w:val="19"/>
+              </w:rPr>
+              <w:t>Heading-delimited chunking works; strip header and hazard blocks; keep bullets and labelled sub-paragraphs whole; a real PDF extractor is required in the build</w:t>
+            </w:r>
+          </w:p>
+        </w:tc>
+      </w:tr>
+      <w:tr>
+        <w:tc>
+          <w:tcPr>
+            <w:tcW w:type="dxa" w:w="2256"/>
+          </w:tcPr>
+          <w:p>
+            <w:r>
+              <w:rPr>
+                <w:sz w:val="19"/>
+              </w:rPr>
+              <w:t>Contact text and stockist list: to be taken from the crawl, content unverified</w:t>
+            </w:r>
+          </w:p>
+        </w:tc>
+        <w:tc>
+          <w:tcPr>
+            <w:tcW w:type="dxa" w:w="2256"/>
+          </w:tcPr>
+          <w:p>
+            <w:r>
+              <w:rPr>
+                <w:sz w:val="19"/>
+              </w:rPr>
+              <w:t>Contact: 0800 538 5746; Office Hours Mon to Fri 9:00am to 5:00pm; the page says: For general and technical enquiries please get in touch with us direct using the details or contact form here; no named individuals; no email printed. Find-a-supplier lists about 25 named stockists. Order-a-sample carries the only prices on the site (sample prices)</w:t>
+            </w:r>
+          </w:p>
+        </w:tc>
+        <w:tc>
+          <w:tcPr>
+            <w:tcW w:type="dxa" w:w="2256"/>
+          </w:tcPr>
+          <w:p>
+            <w:r>
+              <w:rPr>
+                <w:sz w:val="19"/>
+              </w:rPr>
+              <w:t>10.3 Refuse and hand off; 10.5 groups two and three</w:t>
+            </w:r>
+          </w:p>
+        </w:tc>
+        <w:tc>
+          <w:tcPr>
+            <w:tcW w:type="dxa" w:w="2256"/>
+          </w:tcPr>
+          <w:p>
+            <w:r>
+              <w:rPr>
+                <w:sz w:val="19"/>
+              </w:rPr>
+              <w:t>Hand-off text comes from the crawl into the manifest; the stockist list is the merchant vocabulary for the real-names check; sample prices are quotable, product prices still route</w:t>
+            </w:r>
+          </w:p>
+        </w:tc>
+      </w:tr>
+    </w:tbl>
+    <w:p/>
+    <w:p>
+      <w:pPr>
+        <w:pStyle w:val="Heading1"/>
+      </w:pPr>
+      <w:r>
+        <w:t>Appendix D. Decisions taken after review, 15 September 2026</w:t>
+      </w:r>
+    </w:p>
+    <w:p>
+      <w:r>
+        <w:t>Four decisions were taken against an external review of the architecture diagrams, then verified in two adversarial passes. Each changes lines in the register below; the register text is left as written and this table is the decision of record. The reasoning is in docs/architecture/architecture-rationale.md.</w:t>
+      </w:r>
+    </w:p>
+    <w:tbl>
+      <w:tblPr>
+        <w:tblStyle w:val="TableGrid"/>
+        <w:tblW w:type="auto" w:w="0"/>
+        <w:tblLook w:firstColumn="1" w:firstRow="1" w:lastColumn="0" w:lastRow="0" w:noHBand="0" w:noVBand="1" w:val="04A0"/>
+      </w:tblPr>
+      <w:tblGrid>
+        <w:gridCol w:w="3009"/>
+        <w:gridCol w:w="3009"/>
+        <w:gridCol w:w="3009"/>
+      </w:tblGrid>
+      <w:tr>
+        <w:tc>
+          <w:tcPr>
+            <w:tcW w:type="dxa" w:w="3009"/>
+          </w:tcPr>
+          <w:p>
+            <w:r>
+              <w:rPr>
+                <w:sz w:val="19"/>
+              </w:rPr>
+            </w:r>
+            <w:r>
+              <w:rPr>
+                <w:b/>
+                <w:sz w:val="19"/>
+              </w:rPr>
+              <w:t>Decision</w:t>
+            </w:r>
+          </w:p>
+        </w:tc>
+        <w:tc>
+          <w:tcPr>
+            <w:tcW w:type="dxa" w:w="3009"/>
+          </w:tcPr>
+          <w:p>
+            <w:r>
+              <w:rPr>
+                <w:sz w:val="19"/>
+              </w:rPr>
+            </w:r>
+            <w:r>
+              <w:rPr>
+                <w:b/>
+                <w:sz w:val="19"/>
+              </w:rPr>
+              <w:t>Call</w:t>
+            </w:r>
+          </w:p>
+        </w:tc>
+        <w:tc>
+          <w:tcPr>
+            <w:tcW w:type="dxa" w:w="3009"/>
+          </w:tcPr>
+          <w:p>
+            <w:r>
+              <w:rPr>
+                <w:sz w:val="19"/>
+              </w:rPr>
+            </w:r>
+            <w:r>
+              <w:rPr>
+                <w:b/>
+                <w:sz w:val="19"/>
+              </w:rPr>
+              <w:t>Register lines it changes</w:t>
+            </w:r>
+          </w:p>
+        </w:tc>
+      </w:tr>
+      <w:tr>
+        <w:tc>
+          <w:tcPr>
+            <w:tcW w:type="dxa" w:w="3009"/>
+          </w:tcPr>
+          <w:p>
+            <w:r>
+              <w:rPr>
+                <w:sz w:val="19"/>
+              </w:rPr>
+              <w:t>1. Corpus boundary</w:t>
+            </w:r>
+          </w:p>
+        </w:tc>
+        <w:tc>
+          <w:tcPr>
+            <w:tcW w:type="dxa" w:w="3009"/>
+          </w:tcPr>
+          <w:p>
+            <w:r>
+              <w:rPr>
+                <w:sz w:val="19"/>
+              </w:rPr>
+              <w:t>Everything technical the site publishes, 94 units. Out: near-duplicate colour pages, boilerplate category pages, non-technical documents. Cost accepted: extraction QA on 31 unprobed datasheets and 3 unextracted guides, paid through the ingestion report and bounded by the spend order</w:t>
+            </w:r>
+          </w:p>
+        </w:tc>
+        <w:tc>
+          <w:tcPr>
+            <w:tcW w:type="dxa" w:w="3009"/>
+          </w:tcPr>
+          <w:p>
+            <w:r>
+              <w:rPr>
+                <w:sz w:val="19"/>
+              </w:rPr>
+              <w:t>10.2 about-forty row; 8.7 spend order; Appendix A scope limits</w:t>
+            </w:r>
+          </w:p>
+        </w:tc>
+      </w:tr>
+      <w:tr>
+        <w:tc>
+          <w:tcPr>
+            <w:tcW w:type="dxa" w:w="3009"/>
+          </w:tcPr>
+          <w:p>
+            <w:r>
+              <w:rPr>
+                <w:sz w:val="19"/>
+              </w:rPr>
+              <w:t>2. Extract path</w:t>
+            </w:r>
+          </w:p>
+        </w:tc>
+        <w:tc>
+          <w:tcPr>
+            <w:tcW w:type="dxa" w:w="3009"/>
+          </w:tcPr>
+          <w:p>
+            <w:r>
+              <w:rPr>
+                <w:sz w:val="19"/>
+              </w:rPr>
+              <w:t>Verbatim by code: the top passage printed whole with its citation (two passages on the calculation edge, coverage and pack size), by the same quote-and-cite code that prints the cited hand-off and the refusal. The model runs on Compose only. A relevance gate refuses with not stated in the indexed material when the asked-for property or substrate term, or a synonym, is absent from the passage (a router step on Extract; check 6 on Compose). Compliance: the brief's use a local LLM to formulate an answer is met where formulation happens; the record already prints Route, Cited hand-off and Refuse without the model. A model quote-and-stop over two passages stays a roadmap option, gated on a measured warm call under ten seconds</w:t>
+            </w:r>
+          </w:p>
+        </w:tc>
+        <w:tc>
+          <w:tcPr>
+            <w:tcW w:type="dxa" w:w="3009"/>
+          </w:tcPr>
+          <w:p>
+            <w:r>
+              <w:rPr>
+                <w:sz w:val="19"/>
+              </w:rPr>
+              <w:t>9.1 stays on every path, mode changes; 9.2 Extract row (quotes and stops, or is bypassed); 10.3 Answer row (extract: quote and stop over two passages); 10.5 group one, qualifiers travel (now within the printed passage; document-level caveats appended by code); a sixth post-generation check added</w:t>
+            </w:r>
+          </w:p>
+        </w:tc>
+      </w:tr>
+      <w:tr>
+        <w:tc>
+          <w:tcPr>
+            <w:tcW w:type="dxa" w:w="3009"/>
+          </w:tcPr>
+          <w:p>
+            <w:r>
+              <w:rPr>
+                <w:sz w:val="19"/>
+              </w:rPr>
+              <w:t>3. Chunk store</w:t>
+            </w:r>
+          </w:p>
+        </w:tc>
+        <w:tc>
+          <w:tcPr>
+            <w:tcW w:type="dxa" w:w="3009"/>
+          </w:tcPr>
+          <w:p>
+            <w:r>
+              <w:rPr>
+                <w:sz w:val="19"/>
+              </w:rPr>
+              <w:t>One store: embeddings plus payload per chunk, and one manifest of documents (type, authority rank, audience tag, date, link, caveat sentences, excluded documents, contact text, name lists, embedding-model tag, chunking version), swapped together. Prototype: one array and one manifest file. Production: a vector database with payload, or a vector column in the company's existing database. The authored configuration (routing table, vocabularies with synonyms, deferral phrases, authority and audience rules, exclusion rules) is hand-written and read by both the indexer and the engine</w:t>
+            </w:r>
+          </w:p>
+        </w:tc>
+        <w:tc>
+          <w:tcPr>
+            <w:tcW w:type="dxa" w:w="3009"/>
+          </w:tcPr>
+          <w:p>
+            <w:r>
+              <w:rPr>
+                <w:sz w:val="19"/>
+              </w:rPr>
+              <w:t>10.3 Ingest row (the source manifest now lives with the store); 11 store decision (numpy versus a database); 10.5 group four index check (model tag and chunking version)</w:t>
+            </w:r>
+          </w:p>
+        </w:tc>
+      </w:tr>
+      <w:tr>
+        <w:tc>
+          <w:tcPr>
+            <w:tcW w:type="dxa" w:w="3009"/>
+          </w:tcPr>
+          <w:p>
+            <w:r>
+              <w:rPr>
+                <w:sz w:val="19"/>
+              </w:rPr>
+              <w:t>4. Second source for the queue</w:t>
+            </w:r>
+          </w:p>
+        </w:tc>
+        <w:tc>
+          <w:tcPr>
+            <w:tcW w:type="dxa" w:w="3009"/>
+          </w:tcPr>
+          <w:p>
+            <w:r>
+              <w:rPr>
+                <w:sz w:val="19"/>
+              </w:rPr>
+              <w:t>Staff-knowledge capture (agreed answer set, failure library, compatibility matrix as text) is the second producer; the policy list goes to the authored configuration. CRM is a channel adapter, not a content source: the record classes it as a system of record, integration not corpus. If capture yields structured configuration only, the queue collapses to a scheduled re-index</w:t>
+            </w:r>
+          </w:p>
+        </w:tc>
+        <w:tc>
+          <w:tcPr>
+            <w:tcW w:type="dxa" w:w="3009"/>
+          </w:tcPr>
+          <w:p>
+            <w:r>
+              <w:rPr>
+                <w:sz w:val="19"/>
+              </w:rPr>
+              <w:t>13 next steps; 10.7 scale table, staff-only content is added; Appendix A channel and integration lines</w:t>
+            </w:r>
+          </w:p>
+        </w:tc>
+      </w:tr>
+      <w:tr>
+        <w:tc>
+          <w:tcPr>
+            <w:tcW w:type="dxa" w:w="3009"/>
+          </w:tcPr>
+          <w:p>
+            <w:r>
+              <w:rPr>
+                <w:sz w:val="19"/>
+              </w:rPr>
+              <w:t>Router order</w:t>
+            </w:r>
+          </w:p>
+        </w:tc>
+        <w:tc>
+          <w:tcPr>
+            <w:tcW w:type="dxa" w:w="3009"/>
+          </w:tcPr>
+          <w:p>
+            <w:r>
+              <w:rPr>
+                <w:sz w:val="19"/>
+              </w:rPr>
+              <w:t>Evaluated in order: below threshold, published deferral, symptom or photograph, relevance gate, uncued load-bearing slot, calculation words, one document and a factual ask, otherwise compose. A published deferral beats a computed quantity (how much Solo for MgO board gets the sheet's contact us, not a bag count). A photograph question that retrieves nothing still gets cannot see photographs from the hand-off renderer, keyed on the slot</w:t>
+            </w:r>
+          </w:p>
+        </w:tc>
+        <w:tc>
+          <w:tcPr>
+            <w:tcW w:type="dxa" w:w="3009"/>
+          </w:tcPr>
+          <w:p>
+            <w:r>
+              <w:rPr>
+                <w:sz w:val="19"/>
+              </w:rPr>
+              <w:t>9.2 orchestration table; 10.5 override a published deferral; 10.5 do arithmetic; 10.5 diagnose from symptoms or photographs</w:t>
+            </w:r>
+          </w:p>
+        </w:tc>
+      </w:tr>
+      <w:tr>
+        <w:tc>
+          <w:tcPr>
+            <w:tcW w:type="dxa" w:w="3009"/>
+          </w:tcPr>
+          <w:p>
+            <w:r>
+              <w:rPr>
+                <w:sz w:val="19"/>
+              </w:rPr>
+              <w:t>Load-bearing slots</w:t>
+            </w:r>
+          </w:p>
+        </w:tc>
+        <w:tc>
+          <w:tcPr>
+            <w:tcW w:type="dxa" w:w="3009"/>
+          </w:tcPr>
+          <w:p>
+            <w:r>
+              <w:rPr>
+                <w:sz w:val="19"/>
+              </w:rPr>
+              <w:t>Substrate and inside/outside are load-bearing. Cued in the question: the value is used and stated. Uncued: inside/outside is answered per option; substrate is asked back through the hand-off renderer, with what is published about choosing by substrate. Other missing slots become stated assumptions</w:t>
+            </w:r>
+          </w:p>
+        </w:tc>
+        <w:tc>
+          <w:tcPr>
+            <w:tcW w:type="dxa" w:w="3009"/>
+          </w:tcPr>
+          <w:p>
+            <w:r>
+              <w:rPr>
+                <w:sz w:val="19"/>
+              </w:rPr>
+              <w:t>10.2 single-turn row (the clarify gate becomes answer with stated assumptions); 10.5 clarify gate row; 7.1 clarify gate</w:t>
+            </w:r>
+          </w:p>
+        </w:tc>
+      </w:tr>
+      <w:tr>
+        <w:tc>
+          <w:tcPr>
+            <w:tcW w:type="dxa" w:w="3009"/>
+          </w:tcPr>
+          <w:p>
+            <w:r>
+              <w:rPr>
+                <w:sz w:val="19"/>
+              </w:rPr>
+              <w:t>Staff mode and drafting</w:t>
+            </w:r>
+          </w:p>
+        </w:tc>
+        <w:tc>
+          <w:tcPr>
+            <w:tcW w:type="dxa" w:w="3009"/>
+          </w:tcPr>
+          <w:p>
+            <w:r>
+              <w:rPr>
+                <w:sz w:val="19"/>
+              </w:rPr>
+              <w:t>Staff mode always extracts; staff compose on request is roadmap. The staff drafting mode is not built: generation by definition, needs pasted-email handling and a no-commitments rule, does not fit the hour</w:t>
+            </w:r>
+          </w:p>
+        </w:tc>
+        <w:tc>
+          <w:tcPr>
+            <w:tcW w:type="dxa" w:w="3009"/>
+          </w:tcPr>
+          <w:p>
+            <w:r>
+              <w:rPr>
+                <w:sz w:val="19"/>
+              </w:rPr>
+              <w:t>10.7 staff mode defaults to extract and composes only on request; 10.3 Answer row (a staff drafting mode); 10.5 commit in a draft</w:t>
+            </w:r>
+          </w:p>
+        </w:tc>
+      </w:tr>
+    </w:tbl>
+    <w:p/>
     <w:sectPr>
       <w:headerReference w:type="default" r:id="rId8"/>
       <w:pgSz w:w="11906" w:h="16838"/>

</xml_diff>